<commit_message>
Indice de Caminabilidad 0-100 (Celda 14D): notebook, CSV, seccion en informe Word y metodologia en contexto
</commit_message>
<xml_diff>
--- a/outputs/informes/informe_caminabilidad_barrio_obrero.docx
+++ b/outputs/informes/informe_caminabilidad_barrio_obrero.docx
@@ -2175,6 +2175,679 @@
         <w:t>Nota: los umbrales provienen mayormente de literatura anglosajona (EE. UU. y Australia). No existe un estándar nacional colombiano de densidad de intersecciones ampliamente adoptado, por lo que aquí se usan como referencia comparativa, con la Comuna 9 aportando el contraste local. Contenido reformulado para cumplir con las restricciones de licencia de las fuentes.</w:t>
       </w:r>
     </w:p>
+    <w:p>
+      <w:pPr>
+        <w:spacing w:before="240" w:after="120"/>
+      </w:pPr>
+      <w:r>
+        <w:rPr>
+          <w:rFonts w:ascii="Arial" w:hAnsi="Arial"/>
+          <w:b/>
+          <w:color w:val="1B4F8A"/>
+          <w:sz w:val="28"/>
+        </w:rPr>
+        <w:t>Índice de Caminabilidad (0–100)</w:t>
+      </w:r>
+    </w:p>
+    <w:p>
+      <w:pPr>
+        <w:spacing w:after="160"/>
+        <w:jc w:val="both"/>
+      </w:pPr>
+      <w:r>
+        <w:rPr>
+          <w:rFonts w:ascii="Arial" w:hAnsi="Arial"/>
+          <w:b w:val="0"/>
+          <w:sz w:val="22"/>
+        </w:rPr>
+        <w:t>Para resumir la caminabilidad en una sola cifra, construimos un índice de 0 a 100 que combina tres indicadores de la red peatonal. La normalización usa referencias fijas por indicador (no valores relativos entre zonas), de modo que el resultado sea estable y comparable a lo largo del tiempo. Cada indicador se lleva a una escala de 0 a 100 y luego se pondera; la longitud de segmento se trata como indicador inverso, ya que las cuadras más cortas favorecen la caminabilidad.</w:t>
+      </w:r>
+    </w:p>
+    <w:p>
+      <w:pPr>
+        <w:spacing w:after="160"/>
+        <w:jc w:val="both"/>
+      </w:pPr>
+      <w:r>
+        <w:rPr>
+          <w:rFonts w:ascii="Arial" w:hAnsi="Arial"/>
+          <w:b w:val="0"/>
+          <w:sz w:val="22"/>
+        </w:rPr>
+        <w:t>Los pesos por defecto son: densidad de intersecciones 0.45, densidad de calle 0.35 y longitud de segmento 0.20. Tanto los umbrales como los pesos pueden ajustarse según el criterio del equipo. La siguiente tabla resume las referencias empleadas y los puntajes obtenidos por cada zona.</w:t>
+      </w:r>
+    </w:p>
+    <w:tbl>
+      <w:tblPr>
+        <w:tblStyle w:val="Cuadrculaclara-nfasis1"/>
+        <w:tblW w:type="auto" w:w="0"/>
+        <w:jc w:val="center"/>
+        <w:tblLook w:firstColumn="1" w:firstRow="1" w:lastColumn="0" w:lastRow="0" w:noHBand="0" w:noVBand="1" w:val="04A0"/>
+      </w:tblPr>
+      <w:tblGrid>
+        <w:gridCol w:w="1440"/>
+        <w:gridCol w:w="1440"/>
+        <w:gridCol w:w="1440"/>
+        <w:gridCol w:w="1440"/>
+        <w:gridCol w:w="1440"/>
+        <w:gridCol w:w="1440"/>
+      </w:tblGrid>
+      <w:tr>
+        <w:tc>
+          <w:tcPr>
+            <w:tcW w:type="dxa" w:w="1440"/>
+          </w:tcPr>
+          <w:p>
+            <w:pPr>
+              <w:jc w:val="center"/>
+            </w:pPr>
+            <w:r>
+              <w:rPr>
+                <w:rFonts w:ascii="Arial" w:hAnsi="Arial"/>
+                <w:b/>
+                <w:sz w:val="18"/>
+              </w:rPr>
+              <w:t>Indicador</w:t>
+            </w:r>
+          </w:p>
+        </w:tc>
+        <w:tc>
+          <w:tcPr>
+            <w:tcW w:type="dxa" w:w="1440"/>
+          </w:tcPr>
+          <w:p>
+            <w:pPr>
+              <w:jc w:val="center"/>
+            </w:pPr>
+            <w:r>
+              <w:rPr>
+                <w:rFonts w:ascii="Arial" w:hAnsi="Arial"/>
+                <w:b/>
+                <w:sz w:val="18"/>
+              </w:rPr>
+              <w:t>ref_min</w:t>
+            </w:r>
+          </w:p>
+        </w:tc>
+        <w:tc>
+          <w:tcPr>
+            <w:tcW w:type="dxa" w:w="1440"/>
+          </w:tcPr>
+          <w:p>
+            <w:pPr>
+              <w:jc w:val="center"/>
+            </w:pPr>
+            <w:r>
+              <w:rPr>
+                <w:rFonts w:ascii="Arial" w:hAnsi="Arial"/>
+                <w:b/>
+                <w:sz w:val="18"/>
+              </w:rPr>
+              <w:t>ref_max</w:t>
+            </w:r>
+          </w:p>
+        </w:tc>
+        <w:tc>
+          <w:tcPr>
+            <w:tcW w:type="dxa" w:w="1440"/>
+          </w:tcPr>
+          <w:p>
+            <w:pPr>
+              <w:jc w:val="center"/>
+            </w:pPr>
+            <w:r>
+              <w:rPr>
+                <w:rFonts w:ascii="Arial" w:hAnsi="Arial"/>
+                <w:b/>
+                <w:sz w:val="18"/>
+              </w:rPr>
+              <w:t>Sentido</w:t>
+            </w:r>
+          </w:p>
+        </w:tc>
+        <w:tc>
+          <w:tcPr>
+            <w:tcW w:type="dxa" w:w="1440"/>
+          </w:tcPr>
+          <w:p>
+            <w:pPr>
+              <w:jc w:val="center"/>
+            </w:pPr>
+            <w:r>
+              <w:rPr>
+                <w:rFonts w:ascii="Arial" w:hAnsi="Arial"/>
+                <w:b/>
+                <w:sz w:val="18"/>
+              </w:rPr>
+              <w:t>Score BO</w:t>
+            </w:r>
+          </w:p>
+        </w:tc>
+        <w:tc>
+          <w:tcPr>
+            <w:tcW w:type="dxa" w:w="1440"/>
+          </w:tcPr>
+          <w:p>
+            <w:pPr>
+              <w:jc w:val="center"/>
+            </w:pPr>
+            <w:r>
+              <w:rPr>
+                <w:rFonts w:ascii="Arial" w:hAnsi="Arial"/>
+                <w:b/>
+                <w:sz w:val="18"/>
+              </w:rPr>
+              <w:t>Score C9</w:t>
+            </w:r>
+          </w:p>
+        </w:tc>
+      </w:tr>
+      <w:tr>
+        <w:tc>
+          <w:tcPr>
+            <w:tcW w:type="dxa" w:w="1440"/>
+          </w:tcPr>
+          <w:p>
+            <w:pPr>
+              <w:jc w:val="center"/>
+            </w:pPr>
+            <w:r>
+              <w:rPr>
+                <w:rFonts w:ascii="Arial" w:hAnsi="Arial"/>
+                <w:b w:val="0"/>
+                <w:sz w:val="18"/>
+              </w:rPr>
+              <w:t>Densidad de intersecciones (int/km²)</w:t>
+            </w:r>
+          </w:p>
+        </w:tc>
+        <w:tc>
+          <w:tcPr>
+            <w:tcW w:type="dxa" w:w="1440"/>
+          </w:tcPr>
+          <w:p>
+            <w:pPr>
+              <w:jc w:val="center"/>
+            </w:pPr>
+            <w:r>
+              <w:rPr>
+                <w:rFonts w:ascii="Arial" w:hAnsi="Arial"/>
+                <w:b w:val="0"/>
+                <w:sz w:val="18"/>
+              </w:rPr>
+              <w:t>100</w:t>
+            </w:r>
+          </w:p>
+        </w:tc>
+        <w:tc>
+          <w:tcPr>
+            <w:tcW w:type="dxa" w:w="1440"/>
+          </w:tcPr>
+          <w:p>
+            <w:pPr>
+              <w:jc w:val="center"/>
+            </w:pPr>
+            <w:r>
+              <w:rPr>
+                <w:rFonts w:ascii="Arial" w:hAnsi="Arial"/>
+                <w:b w:val="0"/>
+                <w:sz w:val="18"/>
+              </w:rPr>
+              <w:t>800</w:t>
+            </w:r>
+          </w:p>
+        </w:tc>
+        <w:tc>
+          <w:tcPr>
+            <w:tcW w:type="dxa" w:w="1440"/>
+          </w:tcPr>
+          <w:p>
+            <w:pPr>
+              <w:jc w:val="center"/>
+            </w:pPr>
+            <w:r>
+              <w:rPr>
+                <w:rFonts w:ascii="Arial" w:hAnsi="Arial"/>
+                <w:b w:val="0"/>
+                <w:sz w:val="18"/>
+              </w:rPr>
+              <w:t>directo</w:t>
+            </w:r>
+          </w:p>
+        </w:tc>
+        <w:tc>
+          <w:tcPr>
+            <w:tcW w:type="dxa" w:w="1440"/>
+          </w:tcPr>
+          <w:p>
+            <w:pPr>
+              <w:jc w:val="center"/>
+            </w:pPr>
+            <w:r>
+              <w:rPr>
+                <w:rFonts w:ascii="Arial" w:hAnsi="Arial"/>
+                <w:b w:val="0"/>
+                <w:sz w:val="18"/>
+              </w:rPr>
+              <w:t>73.9</w:t>
+            </w:r>
+          </w:p>
+        </w:tc>
+        <w:tc>
+          <w:tcPr>
+            <w:tcW w:type="dxa" w:w="1440"/>
+          </w:tcPr>
+          <w:p>
+            <w:pPr>
+              <w:jc w:val="center"/>
+            </w:pPr>
+            <w:r>
+              <w:rPr>
+                <w:rFonts w:ascii="Arial" w:hAnsi="Arial"/>
+                <w:b w:val="0"/>
+                <w:sz w:val="18"/>
+              </w:rPr>
+              <w:t>96.7</w:t>
+            </w:r>
+          </w:p>
+        </w:tc>
+      </w:tr>
+      <w:tr>
+        <w:tc>
+          <w:tcPr>
+            <w:tcW w:type="dxa" w:w="1440"/>
+          </w:tcPr>
+          <w:p>
+            <w:pPr>
+              <w:jc w:val="center"/>
+            </w:pPr>
+            <w:r>
+              <w:rPr>
+                <w:rFonts w:ascii="Arial" w:hAnsi="Arial"/>
+                <w:b w:val="0"/>
+                <w:sz w:val="18"/>
+              </w:rPr>
+              <w:t>Densidad de calle (km/km²)</w:t>
+            </w:r>
+          </w:p>
+        </w:tc>
+        <w:tc>
+          <w:tcPr>
+            <w:tcW w:type="dxa" w:w="1440"/>
+          </w:tcPr>
+          <w:p>
+            <w:pPr>
+              <w:jc w:val="center"/>
+            </w:pPr>
+            <w:r>
+              <w:rPr>
+                <w:rFonts w:ascii="Arial" w:hAnsi="Arial"/>
+                <w:b w:val="0"/>
+                <w:sz w:val="18"/>
+              </w:rPr>
+              <w:t>20</w:t>
+            </w:r>
+          </w:p>
+        </w:tc>
+        <w:tc>
+          <w:tcPr>
+            <w:tcW w:type="dxa" w:w="1440"/>
+          </w:tcPr>
+          <w:p>
+            <w:pPr>
+              <w:jc w:val="center"/>
+            </w:pPr>
+            <w:r>
+              <w:rPr>
+                <w:rFonts w:ascii="Arial" w:hAnsi="Arial"/>
+                <w:b w:val="0"/>
+                <w:sz w:val="18"/>
+              </w:rPr>
+              <w:t>90</w:t>
+            </w:r>
+          </w:p>
+        </w:tc>
+        <w:tc>
+          <w:tcPr>
+            <w:tcW w:type="dxa" w:w="1440"/>
+          </w:tcPr>
+          <w:p>
+            <w:pPr>
+              <w:jc w:val="center"/>
+            </w:pPr>
+            <w:r>
+              <w:rPr>
+                <w:rFonts w:ascii="Arial" w:hAnsi="Arial"/>
+                <w:b w:val="0"/>
+                <w:sz w:val="18"/>
+              </w:rPr>
+              <w:t>directo</w:t>
+            </w:r>
+          </w:p>
+        </w:tc>
+        <w:tc>
+          <w:tcPr>
+            <w:tcW w:type="dxa" w:w="1440"/>
+          </w:tcPr>
+          <w:p>
+            <w:pPr>
+              <w:jc w:val="center"/>
+            </w:pPr>
+            <w:r>
+              <w:rPr>
+                <w:rFonts w:ascii="Arial" w:hAnsi="Arial"/>
+                <w:b w:val="0"/>
+                <w:sz w:val="18"/>
+              </w:rPr>
+              <w:t>73.4</w:t>
+            </w:r>
+          </w:p>
+        </w:tc>
+        <w:tc>
+          <w:tcPr>
+            <w:tcW w:type="dxa" w:w="1440"/>
+          </w:tcPr>
+          <w:p>
+            <w:pPr>
+              <w:jc w:val="center"/>
+            </w:pPr>
+            <w:r>
+              <w:rPr>
+                <w:rFonts w:ascii="Arial" w:hAnsi="Arial"/>
+                <w:b w:val="0"/>
+                <w:sz w:val="18"/>
+              </w:rPr>
+              <w:t>83.4</w:t>
+            </w:r>
+          </w:p>
+        </w:tc>
+      </w:tr>
+      <w:tr>
+        <w:tc>
+          <w:tcPr>
+            <w:tcW w:type="dxa" w:w="1440"/>
+          </w:tcPr>
+          <w:p>
+            <w:pPr>
+              <w:jc w:val="center"/>
+            </w:pPr>
+            <w:r>
+              <w:rPr>
+                <w:rFonts w:ascii="Arial" w:hAnsi="Arial"/>
+                <w:b w:val="0"/>
+                <w:sz w:val="18"/>
+              </w:rPr>
+              <w:t>Longitud prom. de segmento (m)</w:t>
+            </w:r>
+          </w:p>
+        </w:tc>
+        <w:tc>
+          <w:tcPr>
+            <w:tcW w:type="dxa" w:w="1440"/>
+          </w:tcPr>
+          <w:p>
+            <w:pPr>
+              <w:jc w:val="center"/>
+            </w:pPr>
+            <w:r>
+              <w:rPr>
+                <w:rFonts w:ascii="Arial" w:hAnsi="Arial"/>
+                <w:b w:val="0"/>
+                <w:sz w:val="18"/>
+              </w:rPr>
+              <w:t>40</w:t>
+            </w:r>
+          </w:p>
+        </w:tc>
+        <w:tc>
+          <w:tcPr>
+            <w:tcW w:type="dxa" w:w="1440"/>
+          </w:tcPr>
+          <w:p>
+            <w:pPr>
+              <w:jc w:val="center"/>
+            </w:pPr>
+            <w:r>
+              <w:rPr>
+                <w:rFonts w:ascii="Arial" w:hAnsi="Arial"/>
+                <w:b w:val="0"/>
+                <w:sz w:val="18"/>
+              </w:rPr>
+              <w:t>150</w:t>
+            </w:r>
+          </w:p>
+        </w:tc>
+        <w:tc>
+          <w:tcPr>
+            <w:tcW w:type="dxa" w:w="1440"/>
+          </w:tcPr>
+          <w:p>
+            <w:pPr>
+              <w:jc w:val="center"/>
+            </w:pPr>
+            <w:r>
+              <w:rPr>
+                <w:rFonts w:ascii="Arial" w:hAnsi="Arial"/>
+                <w:b w:val="0"/>
+                <w:sz w:val="18"/>
+              </w:rPr>
+              <w:t>inverso</w:t>
+            </w:r>
+          </w:p>
+        </w:tc>
+        <w:tc>
+          <w:tcPr>
+            <w:tcW w:type="dxa" w:w="1440"/>
+          </w:tcPr>
+          <w:p>
+            <w:pPr>
+              <w:jc w:val="center"/>
+            </w:pPr>
+            <w:r>
+              <w:rPr>
+                <w:rFonts w:ascii="Arial" w:hAnsi="Arial"/>
+                <w:b w:val="0"/>
+                <w:sz w:val="18"/>
+              </w:rPr>
+              <w:t>98.6</w:t>
+            </w:r>
+          </w:p>
+        </w:tc>
+        <w:tc>
+          <w:tcPr>
+            <w:tcW w:type="dxa" w:w="1440"/>
+          </w:tcPr>
+          <w:p>
+            <w:pPr>
+              <w:jc w:val="center"/>
+            </w:pPr>
+            <w:r>
+              <w:rPr>
+                <w:rFonts w:ascii="Arial" w:hAnsi="Arial"/>
+                <w:b w:val="0"/>
+                <w:sz w:val="18"/>
+              </w:rPr>
+              <w:t>100.0</w:t>
+            </w:r>
+          </w:p>
+        </w:tc>
+      </w:tr>
+      <w:tr>
+        <w:tc>
+          <w:tcPr>
+            <w:tcW w:type="dxa" w:w="1440"/>
+          </w:tcPr>
+          <w:p>
+            <w:pPr>
+              <w:jc w:val="center"/>
+            </w:pPr>
+            <w:r>
+              <w:rPr>
+                <w:rFonts w:ascii="Arial" w:hAnsi="Arial"/>
+                <w:b/>
+                <w:sz w:val="18"/>
+              </w:rPr>
+              <w:t>Índice de Caminabilidad (0–100)</w:t>
+            </w:r>
+          </w:p>
+        </w:tc>
+        <w:tc>
+          <w:tcPr>
+            <w:tcW w:type="dxa" w:w="1440"/>
+          </w:tcPr>
+          <w:p>
+            <w:pPr>
+              <w:jc w:val="center"/>
+            </w:pPr>
+            <w:r>
+              <w:rPr>
+                <w:rFonts w:ascii="Arial" w:hAnsi="Arial"/>
+                <w:b/>
+                <w:sz w:val="18"/>
+              </w:rPr>
+            </w:r>
+          </w:p>
+        </w:tc>
+        <w:tc>
+          <w:tcPr>
+            <w:tcW w:type="dxa" w:w="1440"/>
+          </w:tcPr>
+          <w:p>
+            <w:pPr>
+              <w:jc w:val="center"/>
+            </w:pPr>
+            <w:r>
+              <w:rPr>
+                <w:rFonts w:ascii="Arial" w:hAnsi="Arial"/>
+                <w:b/>
+                <w:sz w:val="18"/>
+              </w:rPr>
+            </w:r>
+          </w:p>
+        </w:tc>
+        <w:tc>
+          <w:tcPr>
+            <w:tcW w:type="dxa" w:w="1440"/>
+          </w:tcPr>
+          <w:p>
+            <w:pPr>
+              <w:jc w:val="center"/>
+            </w:pPr>
+            <w:r>
+              <w:rPr>
+                <w:rFonts w:ascii="Arial" w:hAnsi="Arial"/>
+                <w:b/>
+                <w:sz w:val="18"/>
+              </w:rPr>
+            </w:r>
+          </w:p>
+        </w:tc>
+        <w:tc>
+          <w:tcPr>
+            <w:tcW w:type="dxa" w:w="1440"/>
+          </w:tcPr>
+          <w:p>
+            <w:pPr>
+              <w:jc w:val="center"/>
+            </w:pPr>
+            <w:r>
+              <w:rPr>
+                <w:rFonts w:ascii="Arial" w:hAnsi="Arial"/>
+                <w:b/>
+                <w:sz w:val="18"/>
+              </w:rPr>
+              <w:t>78.7</w:t>
+            </w:r>
+          </w:p>
+        </w:tc>
+        <w:tc>
+          <w:tcPr>
+            <w:tcW w:type="dxa" w:w="1440"/>
+          </w:tcPr>
+          <w:p>
+            <w:pPr>
+              <w:jc w:val="center"/>
+            </w:pPr>
+            <w:r>
+              <w:rPr>
+                <w:rFonts w:ascii="Arial" w:hAnsi="Arial"/>
+                <w:b/>
+                <w:sz w:val="18"/>
+              </w:rPr>
+              <w:t>92.7</w:t>
+            </w:r>
+          </w:p>
+        </w:tc>
+      </w:tr>
+    </w:tbl>
+    <w:p>
+      <w:pPr>
+        <w:spacing w:after="160"/>
+        <w:jc w:val="both"/>
+      </w:pPr>
+      <w:r>
+        <w:rPr>
+          <w:rFonts w:ascii="Arial" w:hAnsi="Arial"/>
+          <w:b w:val="0"/>
+          <w:sz w:val="22"/>
+        </w:rPr>
+        <w:t>En la línea base, el Barrio Obrero obtiene un índice de 78.7 y la Comuna 9 de 92.7. Ambos valores son altos y reflejan tramas urbanas caminables. La ventaja de la Comuna 9 proviene sobre todo de su mayor densidad de intersecciones. Conviene recordar que el índice es una síntesis: su lectura debe acompañarse de los indicadores individuales y del contexto de cada zona.</w:t>
+      </w:r>
+    </w:p>
+    <w:p>
+      <w:pPr>
+        <w:jc w:val="center"/>
+      </w:pPr>
+      <w:r>
+        <w:drawing>
+          <wp:inline xmlns:a="http://schemas.openxmlformats.org/drawingml/2006/main" xmlns:pic="http://schemas.openxmlformats.org/drawingml/2006/picture">
+            <wp:extent cx="5669280" cy="2199966"/>
+            <wp:docPr id="10" name="Picture 10"/>
+            <wp:cNvGraphicFramePr>
+              <a:graphicFrameLocks noChangeAspect="1"/>
+            </wp:cNvGraphicFramePr>
+            <a:graphic>
+              <a:graphicData uri="http://schemas.openxmlformats.org/drawingml/2006/picture">
+                <pic:pic>
+                  <pic:nvPicPr>
+                    <pic:cNvPr id="0" name="graf_indice_caminabilidad_barrio_obrero.png"/>
+                    <pic:cNvPicPr/>
+                  </pic:nvPicPr>
+                  <pic:blipFill>
+                    <a:blip r:embed="rId17"/>
+                    <a:stretch>
+                      <a:fillRect/>
+                    </a:stretch>
+                  </pic:blipFill>
+                  <pic:spPr>
+                    <a:xfrm>
+                      <a:off x="0" y="0"/>
+                      <a:ext cx="5669280" cy="2199966"/>
+                    </a:xfrm>
+                    <a:prstGeom prst="rect"/>
+                  </pic:spPr>
+                </pic:pic>
+              </a:graphicData>
+            </a:graphic>
+          </wp:inline>
+        </w:drawing>
+      </w:r>
+    </w:p>
+    <w:p>
+      <w:pPr>
+        <w:spacing w:after="160"/>
+        <w:jc w:val="both"/>
+      </w:pPr>
+      <w:r>
+        <w:rPr>
+          <w:rFonts w:ascii="Arial" w:hAnsi="Arial"/>
+          <w:b w:val="0"/>
+          <w:color w:val="444444"/>
+          <w:sz w:val="19"/>
+        </w:rPr>
+        <w:t>Nota metodológica: los umbrales de referencia se basan en literatura de caminabilidad (US EPA EnviroAtlas; IPEN / U. de Melbourne; regulación de Queensland; Stangl, 2015) y se usan como marco comparativo. El índice es ajustable y está pensado para evolucionar a medida que se incorporen nuevos indicadores o datos locales.</w:t>
+      </w:r>
+    </w:p>
     <w:sectPr>
       <w:pgSz w:w="12240" w:h="15840"/>
       <w:pgMar w:top="1440" w:right="1800" w:bottom="1440" w:left="1800" w:header="720" w:footer="720" w:gutter="0"/>

</xml_diff>

<commit_message>
Indice: tabla mas clara (valor->score, mas alto/bajo = mejor) en notebook e informe Word
</commit_message>
<xml_diff>
--- a/outputs/informes/informe_caminabilidad_barrio_obrero.docx
+++ b/outputs/informes/informe_caminabilidad_barrio_obrero.docx
@@ -2301,7 +2301,7 @@
                 <w:b/>
                 <w:sz w:val="18"/>
               </w:rPr>
-              <w:t>Sentido</w:t>
+              <w:t>Regla</w:t>
             </w:r>
           </w:p>
         </w:tc>
@@ -2319,7 +2319,7 @@
                 <w:b/>
                 <w:sz w:val="18"/>
               </w:rPr>
-              <w:t>Score BO</w:t>
+              <w:t>BO (valor → score)</w:t>
             </w:r>
           </w:p>
         </w:tc>
@@ -2337,7 +2337,7 @@
                 <w:b/>
                 <w:sz w:val="18"/>
               </w:rPr>
-              <w:t>Score C9</w:t>
+              <w:t>C9 (valor → score)</w:t>
             </w:r>
           </w:p>
         </w:tc>
@@ -2411,7 +2411,7 @@
                 <w:b w:val="0"/>
                 <w:sz w:val="18"/>
               </w:rPr>
-              <w:t>directo</w:t>
+              <w:t>más alto = mejor</w:t>
             </w:r>
           </w:p>
         </w:tc>
@@ -2429,7 +2429,7 @@
                 <w:b w:val="0"/>
                 <w:sz w:val="18"/>
               </w:rPr>
-              <w:t>73.9</w:t>
+              <w:t>617 → 73.9</w:t>
             </w:r>
           </w:p>
         </w:tc>
@@ -2447,7 +2447,7 @@
                 <w:b w:val="0"/>
                 <w:sz w:val="18"/>
               </w:rPr>
-              <w:t>96.7</w:t>
+              <w:t>777 → 96.7</w:t>
             </w:r>
           </w:p>
         </w:tc>
@@ -2521,7 +2521,7 @@
                 <w:b w:val="0"/>
                 <w:sz w:val="18"/>
               </w:rPr>
-              <w:t>directo</w:t>
+              <w:t>más alto = mejor</w:t>
             </w:r>
           </w:p>
         </w:tc>
@@ -2539,7 +2539,7 @@
                 <w:b w:val="0"/>
                 <w:sz w:val="18"/>
               </w:rPr>
-              <w:t>73.4</w:t>
+              <w:t>71.4 → 73.4</w:t>
             </w:r>
           </w:p>
         </w:tc>
@@ -2557,7 +2557,7 @@
                 <w:b w:val="0"/>
                 <w:sz w:val="18"/>
               </w:rPr>
-              <w:t>83.4</w:t>
+              <w:t>78.4 → 83.4</w:t>
             </w:r>
           </w:p>
         </w:tc>
@@ -2631,7 +2631,7 @@
                 <w:b w:val="0"/>
                 <w:sz w:val="18"/>
               </w:rPr>
-              <w:t>inverso</w:t>
+              <w:t>más bajo = mejor</w:t>
             </w:r>
           </w:p>
         </w:tc>
@@ -2649,7 +2649,7 @@
                 <w:b w:val="0"/>
                 <w:sz w:val="18"/>
               </w:rPr>
-              <w:t>98.6</w:t>
+              <w:t>41.6 → 98.6</w:t>
             </w:r>
           </w:p>
         </w:tc>
@@ -2667,7 +2667,7 @@
                 <w:b w:val="0"/>
                 <w:sz w:val="18"/>
               </w:rPr>
-              <w:t>100.0</w:t>
+              <w:t>34.8 → 100.0</w:t>
             </w:r>
           </w:p>
         </w:tc>
@@ -2780,6 +2780,20 @@
         </w:tc>
       </w:tr>
     </w:tbl>
+    <w:p>
+      <w:pPr>
+        <w:spacing w:after="160"/>
+        <w:jc w:val="both"/>
+      </w:pPr>
+      <w:r>
+        <w:rPr>
+          <w:rFonts w:ascii="Arial" w:hAnsi="Arial"/>
+          <w:b w:val="0"/>
+          <w:sz w:val="22"/>
+        </w:rPr>
+        <w:t>La columna «valor → score» muestra el dato observado de cada zona y el puntaje 0–100 que resulta tras aplicar la regla. En «más alto = mejor», un valor mayor sube el puntaje; en «más bajo = mejor» (longitud de segmento), un valor menor lo sube, porque las cuadras cortas favorecen la caminabilidad. Por eso los 41.6 m de Barrio Obrero, cercanos al ideal (~40 m), obtienen 98.6.</w:t>
+      </w:r>
+    </w:p>
     <w:p>
       <w:pPr>
         <w:spacing w:after="160"/>

</xml_diff>

<commit_message>
Agrega contexto de malla vial de Cali (PIMU) al notebook, informe Word y contexto del agente
</commit_message>
<xml_diff>
--- a/outputs/informes/informe_caminabilidad_barrio_obrero.docx
+++ b/outputs/informes/informe_caminabilidad_barrio_obrero.docx
@@ -183,6 +183,77 @@
           <w:lang w:val="es-CO"/>
         </w:rPr>
         <w:t>») conservando todos los vértices de cada calle. Sobre ese grafo se calculan las métricas de conectividad: número de intersecciones, longitud total de la red, longitud promedio de los tramos y densidades por unidad de área. Las densidades son especialmente útiles porque permiten comparar zonas de distinto tamaño en igualdad de condiciones.</w:t>
+      </w:r>
+    </w:p>
+    <w:p>
+      <w:pPr>
+        <w:spacing w:after="120" w:before="240"/>
+      </w:pPr>
+      <w:r>
+        <w:rPr>
+          <w:rFonts w:ascii="Arial" w:hAnsi="Arial"/>
+          <w:b/>
+          <w:color w:val="1B4F8A"/>
+          <w:sz w:val="28"/>
+        </w:rPr>
+        <w:t>Contexto de la malla vial de Cali (PIMU)</w:t>
+      </w:r>
+    </w:p>
+    <w:p>
+      <w:pPr>
+        <w:spacing w:after="160"/>
+        <w:jc w:val="both"/>
+      </w:pPr>
+      <w:r>
+        <w:rPr>
+          <w:rFonts w:ascii="Arial" w:hAnsi="Arial"/>
+          <w:b w:val="0"/>
+          <w:sz w:val="22"/>
+        </w:rPr>
+        <w:t>Para situar la jerarquía de las vías analizadas, tomamos como soporte documental el Documento Técnico de Soporte del Plan Integral de Movilidad Urbana (PIMU) de Santiago de Cali. Según esta fuente, la malla vial principal de la ciudad se distribuye en arterias primarias (459,9 km, ~45%), arterias secundarias (306,6 km, ~30%) y vías colectoras (245,28 km, ~24%), para un total aproximado de 1.012 km.</w:t>
+      </w:r>
+    </w:p>
+    <w:p>
+      <w:pPr>
+        <w:spacing w:after="160"/>
+        <w:jc w:val="both"/>
+      </w:pPr>
+      <w:r>
+        <w:rPr>
+          <w:rFonts w:ascii="Arial" w:hAnsi="Arial"/>
+          <w:b w:val="0"/>
+          <w:sz w:val="22"/>
+        </w:rPr>
+        <w:t>Conviene precisar que esa cifra corresponde únicamente a la malla vial principal vehicular, y no a la malla total. Al incorporar las vías locales y barriales, la red vial urbana total de Cali supera los 2.600–2.800 km lineales. La red peatonal que se calcula en este informe con OSMnx es todavía más densa, ya que contabiliza andenes a ambos costados, senderos, callejones y cruces que no forman parte del inventario vehicular formal. Por ello, los kilómetros de red peatonal de las zonas de estudio no son comparables de forma directa con los del PIMU: responden a definiciones, escalas y coberturas distintas.</w:t>
+      </w:r>
+    </w:p>
+    <w:p>
+      <w:pPr>
+        <w:spacing w:after="160"/>
+        <w:jc w:val="both"/>
+      </w:pPr>
+      <w:r>
+        <w:rPr>
+          <w:rFonts w:ascii="Arial" w:hAnsi="Arial"/>
+          <w:b w:val="0"/>
+          <w:sz w:val="22"/>
+        </w:rPr>
+        <w:t>En la práctica, este dato nos sirve para caracterizar la jerarquía de los corredores —por ejemplo, la Av. Roosevelt como vía arteria secundaria o colectora según el tramo, frente a las vías locales que predominan en el Barrio Obrero— y no como referencia numérica de la longitud de la red peatonal.</w:t>
+      </w:r>
+    </w:p>
+    <w:p>
+      <w:pPr>
+        <w:spacing w:after="160"/>
+        <w:jc w:val="both"/>
+      </w:pPr>
+      <w:r>
+        <w:rPr>
+          <w:rFonts w:ascii="Arial" w:hAnsi="Arial"/>
+          <w:b w:val="0"/>
+          <w:color w:val="444444"/>
+          <w:sz w:val="19"/>
+        </w:rPr>
+        <w:t>Fuente: Alcaldía de Santiago de Cali &amp; Secretaría de Movilidad (2018). Plan Integral de Movilidad Urbana de Santiago de Cali (PIMU) — Documento Técnico de Soporte (DTS). Santiago de Cali, Colombia. Cap. Diagnóstico de la Malla Vial Principal (en el marco del POT — Acuerdo 0373 de 2014).</w:t>
       </w:r>
     </w:p>
     <w:p>

</xml_diff>